<commit_message>
fix: update email from info@ra-scuric.de to office@scuric.de in 1.Schreiben template
Co-Authored-By: Claude Opus 4.6 <noreply@anthropic.com>
</commit_message>
<xml_diff>
--- a/server/templates/1.Schreiben.docx
+++ b/server/templates/1.Schreiben.docx
@@ -852,14 +852,7 @@
           <w:rPr>
             <w:sz w:val="16"/>
           </w:rPr>
-          <w:t>info@ra-</w:t>
-        </w:r>
-        <w:r>
-          <w:rPr>
-            <w:spacing w:val="-2"/>
-            <w:sz w:val="16"/>
-          </w:rPr>
-          <w:t>scuric.de</w:t>
+          <w:t>office@scuric.de</w:t>
         </w:r>
       </w:hyperlink>
     </w:p>

</xml_diff>

<commit_message>
feat: v7 - creditor enrichment, matcher webhook, settlement tracking
Major release integrating all three microservices:

Backend:
- Creditor enrichment integration (enrichmentClient.js + circuit breaker)
- Matcher webhook receiver (matcherWebhookController.js)
- Leineweber database integration
- Settlement plan & financial data tracking
- Creditor contact service improvements
- Document generation template updates
- Backfill scripts for enrichment, contact status, leineweber data

Frontend (Legacy):
- Admin dashboard, review, document viewer updates
- Agent portal redirect to admin
- Avatar component, editable cell improvements

Infrastructure:
- Updated .gitignore for generated docs and local configs
- Planning documentation and CLAUDE.md project rules

Co-Authored-By: Claude Opus 4.6 <noreply@anthropic.com>
</commit_message>
<xml_diff>
--- a/server/templates/1.Schreiben.docx
+++ b/server/templates/1.Schreiben.docx
@@ -852,14 +852,7 @@
           <w:rPr>
             <w:sz w:val="16"/>
           </w:rPr>
-          <w:t>info@ra-</w:t>
-        </w:r>
-        <w:r>
-          <w:rPr>
-            <w:spacing w:val="-2"/>
-            <w:sz w:val="16"/>
-          </w:rPr>
-          <w:t>scuric.de</w:t>
+          <w:t>office@scuric.de</w:t>
         </w:r>
       </w:hyperlink>
     </w:p>
@@ -1351,6 +1344,9 @@
       <w:r>
         <w:t xml:space="preserve">„Adresse“, wird von uns bei der Durchführung eines außergerichtlichen Einigungsversuchs im Rahmen des Verbraucherinsolvenzverfahrens gemäß § 305, Abs. 1 Nr. 1 InsO vertreten. </w:t>
       </w:r>
+      <w:r>
+        <w:t>Ordnungsgemäße Bevollmächtigung wird anwaltlich versichert.</w:t>
+      </w:r>
     </w:p>
     <w:p>
       <w:pPr>
@@ -2059,30 +2055,6 @@
           <w:spacing w:val="-2"/>
         </w:rPr>
         <w:t xml:space="preserve"> </w:t>
-      </w:r>
-      <w:r>
-        <w:t>Mit</w:t>
-      </w:r>
-      <w:r>
-        <w:rPr>
-          <w:spacing w:val="-4"/>
-        </w:rPr>
-        <w:t xml:space="preserve"> </w:t>
-      </w:r>
-      <w:r>
-        <w:t>freundlichen</w:t>
-      </w:r>
-      <w:r>
-        <w:rPr>
-          <w:spacing w:val="-4"/>
-        </w:rPr>
-        <w:t xml:space="preserve"> </w:t>
-      </w:r>
-      <w:r>
-        <w:rPr>
-          <w:spacing w:val="-2"/>
-        </w:rPr>
-        <w:t>Grüßen</w:t>
       </w:r>
     </w:p>
     <w:p>
@@ -2150,6 +2122,45 @@
         <w:pStyle w:val="Textkrper"/>
         <w:spacing w:before="95"/>
         <w:ind w:left="141"/>
+        <w:rPr>
+          <w:spacing w:val="-2"/>
+        </w:rPr>
+      </w:pPr>
+    </w:p>
+    <w:p>
+      <w:pPr>
+        <w:pStyle w:val="Textkrper"/>
+        <w:spacing w:before="1"/>
+      </w:pPr>
+      <w:r>
+        <w:t>Mit</w:t>
+      </w:r>
+      <w:r>
+        <w:rPr>
+          <w:spacing w:val="-4"/>
+        </w:rPr>
+        <w:t xml:space="preserve"> </w:t>
+      </w:r>
+      <w:r>
+        <w:t>freundlichen</w:t>
+      </w:r>
+      <w:r>
+        <w:rPr>
+          <w:spacing w:val="-4"/>
+        </w:rPr>
+        <w:t xml:space="preserve"> </w:t>
+      </w:r>
+      <w:r>
+        <w:rPr>
+          <w:spacing w:val="-2"/>
+        </w:rPr>
+        <w:t>Grüßen</w:t>
+      </w:r>
+    </w:p>
+    <w:p>
+      <w:pPr>
+        <w:pStyle w:val="Textkrper"/>
+        <w:spacing w:before="95"/>
       </w:pPr>
       <w:r>
         <w:rPr>

</xml_diff>